<commit_message>
Usar o nome real da loja: Diadê Pipocas Gourmet
Troca "loja de pipocas gourmet" (genérico) pelo nome real na saudação
do bot, no README e na visão geral. Atualiza também o resumo em Word
com o nome da loja e com o progresso real do projeto (preços
definidos, fluxo completo testado, múltiplos sabores, antecedência
mínima), que estava desatualizado desde a primeira versão.
</commit_message>
<xml_diff>
--- a/Resumo-Projeto-PipocaBot.docx
+++ b/Resumo-Projeto-PipocaBot.docx
@@ -26,7 +26,7 @@
           <w:color w:val="C87F0A"/>
           <w:sz w:val="26"/>
         </w:rPr>
-        <w:t>Atendimento automático de pedidos pelo WhatsApp</w:t>
+        <w:t>Atendimento automático de pedidos pelo WhatsApp — Diadê Pipocas Gourmet</w:t>
       </w:r>
     </w:p>
     <w:p/>
@@ -46,7 +46,7 @@
         <w:rPr>
           <w:i w:val="0"/>
         </w:rPr>
-        <w:t>O PipocaBot é um assistente automático que atende os clientes da loja pelo WhatsApp. Ele conversa com o cliente, mostra o cardápio, anota o pedido completo (sabor, tamanho e quantidade), combina entrega ou retirada, e confirma a forma de pagamento, tudo sem que ninguém da loja precise responder mensagem manualmente.</w:t>
+        <w:t>O PipocaBot é um assistente automático que atende os clientes da Diadê Pipocas Gourmet pelo WhatsApp. Ele conversa com o cliente, mostra o cardápio, anota o pedido completo (sabor, tamanho e quantidade), combina entrega ou retirada, e confirma a forma de pagamento, tudo sem que ninguém da loja precise responder mensagem manualmente.</w:t>
       </w:r>
     </w:p>
     <w:p>
@@ -167,7 +167,16 @@
         <w:spacing w:after="80"/>
       </w:pPr>
       <w:r>
-        <w:t>Tamanhos: 50g, 80g, 100g e 150g (mesmo conjunto para todos os sabores).</w:t>
+        <w:t>Tamanhos vendidos: 80g (R$12), 100g (R$18, Kinder Bueno R$22) e 150g (R$25, todos os sabores). O 50g é um brinde dado sob encomenda, não é vendido pelo bot.</w:t>
+      </w:r>
+    </w:p>
+    <w:p>
+      <w:pPr>
+        <w:pStyle w:val="ListBullet"/>
+        <w:spacing w:after="80"/>
+      </w:pPr>
+      <w:r>
+        <w:t>O cliente pode escolher mais de um sabor numa mensagem só (ex: 'Nutella e Torta de Limão').</w:t>
       </w:r>
     </w:p>
     <w:p>
@@ -203,7 +212,7 @@
         <w:spacing w:after="80"/>
       </w:pPr>
       <w:r>
-        <w:t>O cliente pode cancelar ou alterar o pedido pelo próprio bot, enquanto o pedido ainda não entrou em preparo.</w:t>
+        <w:t>A loja trabalha por encomenda: o bot exige pelo menos 24h de antecedência entre o pedido e a entrega/retirada.</w:t>
       </w:r>
     </w:p>
     <w:p>
@@ -212,7 +221,7 @@
         <w:spacing w:after="80"/>
       </w:pPr>
       <w:r>
-        <w:t>A loja tem um número de telefone cadastrado como administrador, que pode pedir o relatório mensal direto pelo WhatsApp.</w:t>
+        <w:t>O cliente pode cancelar o pedido pelo próprio bot, enquanto o pedido ainda não entrou em preparo.</w:t>
       </w:r>
     </w:p>
     <w:p>
@@ -221,7 +230,16 @@
         <w:spacing w:after="80"/>
       </w:pPr>
       <w:r>
-        <w:t>Preços de cada sabor/tamanho e a regra da taxa de entrega ainda serão definidos pela loja.</w:t>
+        <w:t>A loja tem um número de telefone cadastrado como administrador, que vai poder pedir o relatório mensal direto pelo WhatsApp.</w:t>
+      </w:r>
+    </w:p>
+    <w:p>
+      <w:pPr>
+        <w:pStyle w:val="ListBullet"/>
+        <w:spacing w:after="80"/>
+      </w:pPr>
+      <w:r>
+        <w:t>A regra e o valor da taxa de entrega ainda serão definidos pela loja.</w:t>
       </w:r>
     </w:p>
     <w:p>
@@ -314,7 +332,7 @@
           </w:tcPr>
           <w:p>
             <w:r>
-              <w:t>Primeira versão do sistema criada e testada localmente</w:t>
+              <w:t>Projeto salvo com segurança (GitHub, acesso privado)</w:t>
             </w:r>
           </w:p>
         </w:tc>
@@ -336,7 +354,29 @@
           </w:tcPr>
           <w:p>
             <w:r>
-              <w:t>Projeto salvo com segurança (GitHub, acesso privado)</w:t>
+              <w:t>Preços do cardápio definidos pela loja</w:t>
+            </w:r>
+          </w:p>
+        </w:tc>
+      </w:tr>
+      <w:tr>
+        <w:tc>
+          <w:tcPr>
+            <w:tcW w:type="dxa" w:w="1152"/>
+          </w:tcPr>
+          <w:p>
+            <w:r>
+              <w:t>OK</w:t>
+            </w:r>
+          </w:p>
+        </w:tc>
+        <w:tc>
+          <w:tcPr>
+            <w:tcW w:type="dxa" w:w="8208"/>
+          </w:tcPr>
+          <w:p>
+            <w:r>
+              <w:t>Conversa completa de pedido testada de ponta a ponta (cardápio, múltiplos sabores, entrega/retirada, antecedência mínima, cancelamento)</w:t>
             </w:r>
           </w:p>
         </w:tc>
@@ -380,29 +420,7 @@
           </w:tcPr>
           <w:p>
             <w:r>
-              <w:t>Cardápio (preços) definido pela loja</w:t>
-            </w:r>
-          </w:p>
-        </w:tc>
-      </w:tr>
-      <w:tr>
-        <w:tc>
-          <w:tcPr>
-            <w:tcW w:type="dxa" w:w="1152"/>
-          </w:tcPr>
-          <w:p>
-            <w:r>
-              <w:t>--</w:t>
-            </w:r>
-          </w:p>
-        </w:tc>
-        <w:tc>
-          <w:tcPr>
-            <w:tcW w:type="dxa" w:w="8208"/>
-          </w:tcPr>
-          <w:p>
-            <w:r>
-              <w:t>Conversa completa de pedido funcionando de ponta a ponta</w:t>
+              <w:t>Cardápio lido de uma planilha editável pela loja (hoje os preços estão fixos no sistema)</w:t>
             </w:r>
           </w:p>
         </w:tc>
@@ -489,15 +507,6 @@
         <w:spacing w:after="80"/>
       </w:pPr>
       <w:r>
-        <w:t>A loja define os preços de cada sabor/tamanho.</w:t>
-      </w:r>
-    </w:p>
-    <w:p>
-      <w:pPr>
-        <w:pStyle w:val="ListBullet"/>
-        <w:spacing w:after="80"/>
-      </w:pPr>
-      <w:r>
         <w:t>A loja define a regra de cobrança da taxa de entrega.</w:t>
       </w:r>
     </w:p>
@@ -516,7 +525,7 @@
         <w:spacing w:after="80"/>
       </w:pPr>
       <w:r>
-        <w:t>Construir a conversa completa de pedido no sistema.</w:t>
+        <w:t>Ligar o cardápio a uma planilha do Google editável pela loja.</w:t>
       </w:r>
     </w:p>
     <w:p>

</xml_diff>